<commit_message>
Menu « Documentation » : ouvre le guide d'utilisation HTML (/guide/)
- Entrée globale du menu latéral, sous Rapports, ouverte dans un nouvel onglet.
- npm run publier copie le guide dans frontend/public/guide/index.html ;
  nginx le sert en no-cache avec une CSP propre (pas de script, Google Fonts).

Co-Authored-By: Claude Opus 5.5 <noreply@anthropic.com>
</commit_message>
<xml_diff>
--- a/docs/guide/guide-traceagile.docx
+++ b/docs/guide/guide-traceagile.docx
@@ -37,7 +37,7 @@
       <w:r>
         <w:t xml:space="preserve"> (</w:t>
       </w:r>
-      <w:hyperlink w:history="1" r:id="rIdal4et4x8s5jmjdu3acgp0">
+      <w:hyperlink w:history="1" r:id="rIdpyfmdfpw5dfmwg4kuk0uz">
         <w:r>
           <w:rPr>
             <w:color w:val="19647E"/>
@@ -10726,6 +10726,18 @@
           <w:b/>
           <w:bCs/>
         </w:rPr>
+        <w:t xml:space="preserve">Documentation</w:t>
+      </w:r>
+      <w:r>
+        <w:t xml:space="preserve"> : l'entrée du menu latéral, sous Rapports, ouvre ce guide dans un nouvel onglet.</w:t>
+      </w:r>
+    </w:p>
+    <w:p>
+      <w:r>
+        <w:rPr>
+          <w:b/>
+          <w:bCs/>
+        </w:rPr>
         <w:t xml:space="preserve">Lecture seule</w:t>
       </w:r>
       <w:r>

</xml_diff>